<commit_message>
Uji ulang Bab 12.3 dengan engine aturan v1.3
- Rencana Pemasaran v1.3 Bab 12.3: tabel diganti hasil uji ulang
  (Plan A 24,9-29,0%, Plan B 8,9-35,2%), kesimpulan plafon diperbaiki,
  dan asumsi pengujian ditulis lengkap
- Kepekaan plafon Plan A 40%: faktor plafon bonus tim tetap tidak dipakai
- Catatan Hukum v1.2 butir 15 diperbarui
- Simulasi: hanya ringkasan varian 40% yang disimpan (hemat memori)

Co-Authored-By: Claude Opus 5.5 <noreply@anthropic.com>
Claude-Session: https://claude.ai/code/session_01C9951NUBJe5HCAhFhZ3PsQ
</commit_message>
<xml_diff>
--- a/docs/dokumen/Catatan_untuk_Konsultan_Hukum_Mitrans-Astra_v1.2.docx
+++ b/docs/dokumen/Catatan_untuk_Konsultan_Hukum_Mitrans-Astra_v1.2.docx
@@ -621,7 +621,7 @@
                 <w:sz w:val="19"/>
                 <w:szCs w:val="19"/>
               </w:rPr>
-              <w:t>Bila 40% berlaku, ubah plafon Plan A ke 40%. Nominal bonus tidak perlu diubah: dalam uji 5 tahun, Plan A dibayar 31,1–31,8%. Hanya jaringan yang hampir ideal (47%) yang akan dipotong prorata Catatan v1.2: uji ulang dengan engine perhitungan menghasilkan Plan A 24,9–29,0% (lihat butir 15).</w:t>
+              <w:t>Bila 40% berlaku, ubah plafon Plan A ke 40%. Nominal bonus tidak perlu diubah: dalam uji 5 tahun, Plan A dibayar 31,1–31,8%. Hanya jaringan yang hampir ideal (47%) yang akan dipotong prorata Catatan v1.2: uji ulang dengan engine perhitungan menghasilkan Plan A 24,9–29,0%. Dengan plafon 40%, faktor plafon bonus tim tetap tidak pernah dipakai (lihat butir 15 dan Rencana Pemasaran 12.3).</w:t>
             </w:r>
           </w:p>
         </w:tc>
@@ -2513,7 +2513,7 @@
                 <w:sz w:val="19"/>
                 <w:szCs w:val="19"/>
               </w:rPr>
-              <w:t>Bab 12.3 masih memakai hasil uji lama (Plan A 26,5–46,9%, Plan B 26,6–36,7%). Engine perhitungan yang menjalankan aturan v1.3 menghasilkan Plan A 24,9–29,0% dan Plan B 8,9–35,2%. Selisih terbesar karena syarat aktif 2 penjualan per bulan: banyak bonus tim ditahan lalu masuk Pool Aktif</w:t>
+              <w:t>Di v1.3, tabel Bab 12.3 sudah diganti dengan hasil uji ulang engine yang menjalankan aturan v1.3: Plan A 24,9–29,0% dan Plan B 8,9–35,2% (hasil lama: Plan A 26,5–46,9%, Plan B 26,6–36,7%). Asumsi pengujian ditulis lengkap. Selisih terbesar karena syarat aktif 2 penjualan per bulan: banyak bonus tim ditahan lalu masuk Pool Aktif</w:t>
             </w:r>
           </w:p>
         </w:tc>
@@ -2539,7 +2539,7 @@
                 <w:sz w:val="19"/>
                 <w:szCs w:val="19"/>
               </w:rPr>
-              <w:t>Ulangi uji dengan asumsi tertulis, atau ganti tabel Bab 12.3 dengan hasil engine beserta asumsinya, sebelum dokumen diverifikasi asosiasi. Angka di tabel tidak boleh terbaca sebagai proyeksi penghasilan</w:t>
+              <w:t>Mohon konsultan dan asosiasi menilai apakah asumsi pengujian sudah memadai. Coach juga perlu menilai dampak bisnisnya: Pool Aktif menjadi bagian Plan A terbesar setelah Bonus Sponsor. Angka di tabel tidak boleh terbaca sebagai proyeksi penghasilan</w:t>
             </w:r>
           </w:p>
         </w:tc>
@@ -6150,7 +6150,7 @@
       </w:pPr>
       <w:r>
         <w:rPr/>
-        <w:t>Uji internal Rencana Pemasaran Bab 12.3 diulang dengan asumsi tertulis, atau diganti dengan hasil engine perhitungan (butir 15–16 Bagian 1).</w:t>
+        <w:t>Konsultan hukum menilai hasil uji ulang dan asumsinya di Rencana Pemasaran Bab 12.3, serta rumus batas atas Langganan (butir 15–16 Bagian 1).</w:t>
       </w:r>
     </w:p>
     <w:sectPr>

</xml_diff>

<commit_message>
Syarat aktif menjadi 1 penjualan baru pribadi per bulan (keputusan A13)
- Engine: bawaan activeMinPersonalSales = 1; closeThrough tidak gagal
  untuk bulan yang sudah ditutup; uji masa tunggu disusun ulang
- Rencana Pemasaran v1.3: bagian 9.1, contoh 10.2, Lampiran A, dan
  hasil uji Bab 12.3 (Plan A 25,0-29,2%, Plan B 13,1-35,2%)
- Catatan Hukum v1.2: butir A13 dan angka uji diperbarui
- Teks aplikasi, ringkasan aturan, dan rancangan sistem diselaraskan
- Simulasi dijalankan ulang

Co-Authored-By: Claude Opus 5.5 <noreply@anthropic.com>
Claude-Session: https://claude.ai/code/session_01C9951NUBJe5HCAhFhZ3PsQ
</commit_message>
<xml_diff>
--- a/docs/dokumen/Catatan_untuk_Konsultan_Hukum_Mitrans-Astra_v1.2.docx
+++ b/docs/dokumen/Catatan_untuk_Konsultan_Hukum_Mitrans-Astra_v1.2.docx
@@ -274,7 +274,7 @@
       </w:pPr>
       <w:r>
         <w:rPr/>
-        <w:t>Bagian 2B: keputusan aturan sistem v1.3 (A1–A12) yang sudah diputuskan Coach pada 27 Oktober 2026, beserta butir yang perlu dinilai konsultan hukum;</w:t>
+        <w:t>Bagian 2B: keputusan aturan sistem v1.3 (A1–A13) yang sudah diputuskan Coach pada 27 Oktober 2026, beserta butir yang perlu dinilai konsultan hukum;</w:t>
       </w:r>
     </w:p>
     <w:p>
@@ -621,7 +621,7 @@
                 <w:sz w:val="19"/>
                 <w:szCs w:val="19"/>
               </w:rPr>
-              <w:t>Bila 40% berlaku, ubah plafon Plan A ke 40%. Nominal bonus tidak perlu diubah: dalam uji 5 tahun, Plan A dibayar 31,1–31,8%. Hanya jaringan yang hampir ideal (47%) yang akan dipotong prorata Catatan v1.2: uji ulang dengan engine perhitungan menghasilkan Plan A 24,9–29,0%. Dengan plafon 40%, faktor plafon bonus tim tetap tidak pernah dipakai (lihat butir 15 dan Rencana Pemasaran 12.3).</w:t>
+              <w:t>Bila 40% berlaku, ubah plafon Plan A ke 40%. Nominal bonus tidak perlu diubah: dalam uji 5 tahun, Plan A dibayar 31,1–31,8%. Hanya jaringan yang hampir ideal (47%) yang akan dipotong prorata Catatan v1.2: uji ulang dengan engine perhitungan menghasilkan Plan A 25,0–29,2%. Dengan plafon 40%, faktor plafon bonus tim tetap tidak pernah dipakai (lihat butir 15 dan Rencana Pemasaran 12.3).</w:t>
             </w:r>
           </w:p>
         </w:tc>
@@ -2513,7 +2513,7 @@
                 <w:sz w:val="19"/>
                 <w:szCs w:val="19"/>
               </w:rPr>
-              <w:t>Di v1.3, tabel Bab 12.3 sudah diganti dengan hasil uji ulang engine yang menjalankan aturan v1.3: Plan A 24,9–29,0% dan Plan B 8,9–35,2% (hasil lama: Plan A 26,5–46,9%, Plan B 26,6–36,7%). Asumsi pengujian ditulis lengkap. Selisih terbesar karena syarat aktif 2 penjualan per bulan: banyak bonus tim ditahan lalu masuk Pool Aktif</w:t>
+              <w:t>Di v1.3, tabel Bab 12.3 sudah diganti dengan hasil uji ulang engine yang menjalankan aturan v1.3: Plan A 25,0–29,2% dan Plan B 13,1–35,2% (hasil lama: Plan A 26,5–46,9%, Plan B 26,6–36,7%). Asumsi pengujian ditulis lengkap. Selisih terbesar karena banyak Mitra PLS tidak aktif setiap bulan, sehingga bonus timnya ditahan lalu masuk Pool Aktif</w:t>
             </w:r>
           </w:p>
         </w:tc>
@@ -2539,7 +2539,7 @@
                 <w:sz w:val="19"/>
                 <w:szCs w:val="19"/>
               </w:rPr>
-              <w:t>Mohon konsultan dan asosiasi menilai apakah asumsi pengujian sudah memadai. Coach juga perlu menilai dampak bisnisnya: Pool Aktif menjadi bagian Plan A terbesar setelah Bonus Sponsor. Angka di tabel tidak boleh terbaca sebagai proyeksi penghasilan</w:t>
+              <w:t>Mohon konsultan dan asosiasi menilai apakah asumsi pengujian sudah memadai. Hasil ini sudah memakai syarat aktif 1 penjualan per bulan (A13). Angka di tabel tidak boleh terbaca sebagai proyeksi penghasilan</w:t>
             </w:r>
           </w:p>
         </w:tc>
@@ -4719,7 +4719,7 @@
       </w:pPr>
       <w:r>
         <w:rPr/>
-        <w:t>Rencana Pemasaran v1.0–v1.2 tidak mengatur hal berikut. Coach memutuskannya saat sistem perhitungan dirancang, dan semuanya sudah dicantumkan di dokumen v1.3. Butir bertanda "Perlu dinilai" mohon diberi pendapat konsultan hukum.</w:t>
+        <w:t>Butir A1–A12 tidak diatur Rencana Pemasaran v1.0–v1.2; butir A13 mengubah syarat aktif. Coach memutuskannya saat sistem perhitungan dirancang dan diuji, dan semuanya sudah dicantumkan di dokumen v1.3. Butir bertanda "Perlu dinilai" mohon diberi pendapat konsultan hukum.</w:t>
       </w:r>
     </w:p>
     <w:tbl>
@@ -5877,6 +5877,104 @@
           </w:p>
         </w:tc>
       </w:tr>
+      <w:tr>
+        <w:trPr>
+          <w:cantSplit w:val="true"/>
+        </w:trPr>
+        <w:tc>
+          <w:tcPr>
+            <w:tcW w:w="558" w:type="dxa"/>
+            <w:tcBorders>
+              <w:top w:val="single" w:sz="4" w:space="0" w:color="B7C4C9"/>
+              <w:left w:val="single" w:sz="4" w:space="0" w:color="B7C4C9"/>
+              <w:bottom w:val="single" w:sz="4" w:space="0" w:color="B7C4C9"/>
+              <w:right w:val="single" w:sz="4" w:space="0" w:color="B7C4C9"/>
+            </w:tcBorders>
+          </w:tcPr>
+          <w:p>
+            <w:pPr>
+              <w:pStyle w:val="Normal"/>
+              <w:spacing w:before="0" w:after="0"/>
+              <w:jc w:val="left"/>
+              <w:rPr/>
+            </w:pPr>
+            <w:r>
+              <w:rPr>
+                <w:sz w:val="19"/>
+                <w:szCs w:val="19"/>
+              </w:rPr>
+              <w:t>A13</w:t>
+            </w:r>
+          </w:p>
+        </w:tc>
+        <w:tc>
+          <w:tcPr>
+            <w:tcW w:w="5583" w:type="dxa"/>
+            <w:tcBorders>
+              <w:top w:val="single" w:sz="4" w:space="0" w:color="B7C4C9"/>
+              <w:left w:val="single" w:sz="4" w:space="0" w:color="B7C4C9"/>
+              <w:bottom w:val="single" w:sz="4" w:space="0" w:color="B7C4C9"/>
+              <w:right w:val="single" w:sz="4" w:space="0" w:color="B7C4C9"/>
+            </w:tcBorders>
+          </w:tcPr>
+          <w:p>
+            <w:pPr>
+              <w:pStyle w:val="Normal"/>
+              <w:spacing w:before="0" w:after="0"/>
+              <w:jc w:val="left"/>
+              <w:rPr/>
+            </w:pPr>
+            <w:r>
+              <w:rPr>
+                <w:sz w:val="19"/>
+                <w:szCs w:val="19"/>
+              </w:rPr>
+              <w:t>Syarat aktif menjadi paling sedikit 1 penjualan baru pribadi per bulan (v1.2: 2). Dibanding 2 penjualan, Plan A hampir sama (25,0–29,2%), Plan B naik (8,9–12,0% menjadi 13,1–14,2%), dan bonus tim lebih banyak dibayar kepada pembina jaringan daripada masuk Pool Aktif.</w:t>
+            </w:r>
+          </w:p>
+          <w:p>
+            <w:pPr>
+              <w:pStyle w:val="Normal"/>
+              <w:spacing w:before="0" w:after="0"/>
+              <w:jc w:val="left"/>
+              <w:rPr/>
+            </w:pPr>
+            <w:r>
+              <w:rPr>
+                <w:sz w:val="19"/>
+                <w:szCs w:val="19"/>
+              </w:rPr>
+              <w:t>Perlu dinilai: status aktif lebih mudah dicapai lewat pembelian oleh akun yang dikendalikan sendiri; deteksi akun dan sanksi Kode Etik Pasal 18 angka 12 perlu diperkuat</w:t>
+            </w:r>
+          </w:p>
+        </w:tc>
+        <w:tc>
+          <w:tcPr>
+            <w:tcW w:w="3165" w:type="dxa"/>
+            <w:tcBorders>
+              <w:top w:val="single" w:sz="4" w:space="0" w:color="B7C4C9"/>
+              <w:left w:val="single" w:sz="4" w:space="0" w:color="B7C4C9"/>
+              <w:bottom w:val="single" w:sz="4" w:space="0" w:color="B7C4C9"/>
+              <w:right w:val="single" w:sz="4" w:space="0" w:color="B7C4C9"/>
+            </w:tcBorders>
+          </w:tcPr>
+          <w:p>
+            <w:pPr>
+              <w:pStyle w:val="Normal"/>
+              <w:spacing w:before="0" w:after="0"/>
+              <w:jc w:val="left"/>
+              <w:rPr/>
+            </w:pPr>
+            <w:r>
+              <w:rPr>
+                <w:sz w:val="19"/>
+                <w:szCs w:val="19"/>
+              </w:rPr>
+              <w:t>Rencana Pemasaran 9.1, 10.2, Lampiran A</w:t>
+            </w:r>
+          </w:p>
+        </w:tc>
+      </w:tr>
     </w:tbl>
     <w:p>
       <w:pPr>
@@ -6105,7 +6203,7 @@
       </w:pPr>
       <w:r>
         <w:rPr/>
-        <w:t>Coach mengonfirmasi Bagian 2. Keputusan A1–A12 sudah diambil dan dicantumkan di dokumen v1.3 (Bagian 2B).</w:t>
+        <w:t>Coach mengonfirmasi Bagian 2. Keputusan A1–A13 sudah diambil dan dicantumkan di dokumen v1.3 (Bagian 2B).</w:t>
       </w:r>
     </w:p>
     <w:p>

</xml_diff>